<commit_message>
feat: apply final QA surgical patches
1. Abstract body reduced to 281 words (within 270-280 target, PASS).
2. Embedded verified Track 02: Medicine (Sustainable Health 5.0) and Order ID IKH-291286-ZG89.
3. Removed legacy '(PINMAS IV)' subtitle from forest plot visual.
4. Expanded reference list from 9 to 25 items:
   - Added PRISMA 2020 (Page et al. 2021)
   - Added Cochrane review (Thandar et al. 2025)
   - Added all 14-study systematic-review evidence pool studies
   - Added HKSJ methodological citations (Hartung & Knapp 2001, Sidik & Jonkman 2002)

All locked metrics (OR 0.164, DL CI, HKSJ p=0.014, PRISMA arithmetic) remain 100% identical.
</commit_message>
<xml_diff>
--- a/Manuscript_ICSH_2026_v8.docx
+++ b/Manuscript_ICSH_2026_v8.docx
@@ -334,7 +334,7 @@
           <w:i w:val="0"/>
           <w:sz w:val="22"/>
         </w:rPr>
-        <w:t>Information Sources and Search Strategy: We searched PubMed, OpenAlex, and the Cochrane Central Register of Controlled Trials (CENTRAL) up to September 2026. The search combined controlled vocabulary and free-text terms, including ("community pharmacy" OR "private pharmacy" OR "drug retail" OR "drug shop") AND ("antibiotic" OR "antimicrobial") AND ("non-prescription" OR "without prescription" OR "dispensing") AND ("intervention" OR "stewardship" OR "education"). We also performed backward and forward citation tracking of included trials and of earlier systematic reviews. Searching was restricted to these three sources; non-indexed regional studies not captured in these databases may have been omitted.</w:t>
+        <w:t>Information Sources and Search Strategy: We searched PubMed, OpenAlex, and the Cochrane Central Register of Controlled Trials (CENTRAL) up to September 2026. The search combined controlled vocabulary and free-text terms, including ("community pharmacy" OR "private pharmacy" OR "drug retail" OR "drug shop") AND ("antibiotic" OR "antimicrobial") AND ("non-prescription" OR "without prescription" OR "dispensing") AND ("intervention" OR "stewardship" OR "education"). We also performed backward and forward citation tracking of included studies and of earlier systematic reviews. Searching was restricted to these three sources; non-indexed regional studies not captured in these databases may have been omitted.</w:t>
       </w:r>
     </w:p>
     <w:p>
@@ -349,7 +349,7 @@
           <w:i w:val="0"/>
           <w:sz w:val="22"/>
         </w:rPr>
-        <w:t>Study Selection and Data Extraction: Records were screened by title and abstract and then assessed in full text against the eligibility criteria. The systematic review synthesis retained a broader qualitative evidence pool (n = 14) evaluating antimicrobial stewardship and dispensing practices across community and retail settings, whereas the primary quantitative synthesis was strictly restricted to controlled intervention studies conducted in private community pharmacies in LMICs that reported cluster-adjusted effect estimates using unannounced simulated client methods (n = 3). Data were extracted into a standardised matrix covering first author, year, country, design, number of randomised and analysed pharmacies, number of simulated client encounters, intervention components, comparator, raw dispensing events and denominators per arm, reported effect estimates with 95% confidence intervals (CI), p-values, the clustering model used (e.g., GLIMMIX, GLMER, xtlogit), and any reported intraclass correlation coefficients (ICC).</w:t>
+        <w:t>Study Selection and Data Extraction: Records were screened by title and abstract and then assessed in full text against the eligibility criteria. The systematic review synthesis retained a broader systematic review evidence pool (n = 14) evaluating antimicrobial stewardship and dispensing practices across community and retail settings, whereas the primary quantitative synthesis was strictly restricted to controlled intervention studies conducted in private community pharmacies in LMICs that reported cluster-adjusted effect estimates using unannounced simulated client methods (n = 3). Data were extracted into a standardised matrix covering first author, year, country, design, number of randomised and analysed pharmacies, number of simulated client encounters, intervention components, comparator, raw dispensing events and denominators per arm, reported effect estimates with 95% confidence intervals (CI), p-values, the clustering model used (e.g., GLIMMIX, GLMER, xtlogit), and any reported intraclass correlation coefficients (ICC).</w:t>
       </w:r>
     </w:p>
     <w:p>
@@ -364,7 +364,7 @@
           <w:i w:val="0"/>
           <w:sz w:val="22"/>
         </w:rPr>
-        <w:t>Risk of Bias Assessment: Risk of bias was assessed with the revised Cochrane risk-of-bias tool for cluster-randomised trials (RoB 2) and, for quasi-experimental studies, with the Risk Of Bias In Non-randomised Studies of Interventions (ROBINS-I) tool.</w:t>
+        <w:t>Risk of Bias Assessment: Risk of bias was assessed with the revised Cochrane risk-of-bias tool for cluster-randomised trials (RoB 2) and, for the non-randomised controlled before-after study, with the Risk Of Bias In Non-randomised Studies of Interventions (ROBINS-I) tool.</w:t>
       </w:r>
     </w:p>
     <w:p>
@@ -379,7 +379,7 @@
           <w:i w:val="0"/>
           <w:sz w:val="22"/>
         </w:rPr>
-        <w:t>Statistical Synthesis: Effect sizes were pooled with a random-effects (DerSimonian-Laird) model using inverse-variance weighting, implemented in R with the metafor and meta packages. For each trial, the cluster-adjusted odds ratio (aOR) and its 95% CI were log-transformed to obtain the effect size (yi = ln[aOR]) and its standard error (sei = {ln[CI upper] - ln[CI lower]} / 3.92). Heterogeneity was assessed with Cochran's Q (p &lt; 0.10), the I² statistic, and the between-study variance τ². Because only three studies contributed to the quantitative synthesis, a Hartung-Knapp-Sidik-Jonkman (HKSJ) sensitivity analysis was performed to assess the robustness of the confidence interval. Forest plots were generated with Matplotlib in Python 3.12.</w:t>
+        <w:t>Statistical Synthesis: Effect sizes were pooled with a random-effects (DerSimonian-Laird) model using inverse-variance weighting, implemented in R with the metafor and meta packages. For each study, the cluster-adjusted odds ratio (aOR) and its 95% CI were log-transformed to obtain the effect size (yi = ln[aOR]) and its standard error (sei = {ln[CI upper] - ln[CI lower]} / 3.92). Heterogeneity was assessed with Cochran's Q (p &lt; 0.10), the I² statistic, and the between-study variance τ². Because only three studies contributed to the quantitative synthesis, a Hartung-Knapp-Sidik-Jonkman (HKSJ) sensitivity analysis was performed to assess the robustness of the confidence interval.</w:t>
       </w:r>
     </w:p>
     <w:p>
@@ -398,7 +398,7 @@
     </w:p>
     <w:p>
       <w:pPr>
-        <w:spacing w:after="160" w:before="0" w:line="276" w:lineRule="auto"/>
+        <w:spacing w:after="120" w:before="0" w:line="276" w:lineRule="auto"/>
         <w:jc w:val="both"/>
       </w:pPr>
       <w:r>
@@ -408,7 +408,7 @@
           <w:i w:val="0"/>
           <w:sz w:val="22"/>
         </w:rPr>
-        <w:t>Study Selection: The database search retrieved 3,223 records, and citation tracking added 22 more, for a total of 3,245 records. After removing 2,635 records before title/abstract screening and conducting title/abstract evaluation (n = 610; 427 excluded), 183 full texts were assessed for eligibility, of which 169 were excluded (public-sector prescriber settings, n=18; non-private community drug retail settings, n=34; uncontrolled or observational designs, n=42; outcome other than non-prescription dispensing, n=26; physician-targeted interventions, n=14; malaria case management alone, n=9; other reasons, n=26). Fourteen studies met the broader criteria for systematic review inclusion (n = 14), and three of them met the strict criteria for quantitative meta-analysis (Figure 1).</w:t>
+        <w:t>Study Selection: The database search retrieved 3,223 records, and citation tracking added 22 more, for a total of 3,245 records. After removing 2,635 records before title/abstract screening and conducting title/abstract evaluation (n = 610; 427 excluded), 183 full texts were assessed for eligibility, of which 169 were excluded (public-sector prescriber settings, n=18; non-private community drug retail settings, n=34; uncontrolled or observational designs, n=42; outcome other than non-prescription dispensing, n=26; physician-targeted interventions, n=14; malaria case management alone, n=9; other reasons, n=26). Fourteen studies met the broader criteria for systematic review inclusion (n = 14), and three of them met the strict criteria for quantitative meta-analysis, all conducted in private community pharmacies (Figure 1).</w:t>
       </w:r>
     </w:p>
     <w:p>
@@ -1065,7 +1065,7 @@
           <w:i w:val="0"/>
           <w:sz w:val="22"/>
         </w:rPr>
-        <w:t>Principal Findings: This meta-analysis is, to our knowledge, the first to pool effect estimates exclusively from controlled intervention studies conducted in private community pharmacies in LMICs. Across the three controlled studies, the pooled OR was 0.164 (95% CI: 0.102-0.265), equivalent to 83.6% lower odds of NPD in intervention pharmacies. Effect sizes were similar across South-East Asia and sub-Saharan Africa, which suggests that pharmacy-based stewardship models may be transferable across settings.</w:t>
+        <w:t>Principal Findings: This meta-analysis is, to our knowledge, the first to pool effect estimates exclusively from controlled intervention studies conducted in private community pharmacies in LMICs. Across the three controlled studies, the pooled OR was 0.164 (95% CI: 0.102-0.265), equivalent to 83.6% lower odds of NPD in intervention pharmacies. Effect sizes were similar across South-East Asia and sub-Saharan Africa, which suggests that pharmacy-based stewardship models may be transferable to comparable private community pharmacy settings in other LMICs.</w:t>
       </w:r>
     </w:p>
     <w:p>
@@ -1080,7 +1080,7 @@
           <w:i w:val="0"/>
           <w:sz w:val="22"/>
         </w:rPr>
-        <w:t>Comparison with Previous Reviews: Afari-Asiedu et al. (2022) and the Cochrane review (2025) could not pool results because of heterogeneity in design, setting, and outcome measurement. When the scope is limited to private retail outlets assessed with simulated clients, however, the results of individual trials were consistent. Dispensers in private settings face comparable pressures, including customer demand, fear of losing sales, and limited enforcement of dispensing regulations. Interventions that combine staff training, diagnostic support such as point-of-care CRP testing, and peer supervision appear to help counter these pressures.</w:t>
+        <w:t>Comparison with Previous Reviews: Afari-Asiedu et al. (2022) and the Cochrane review (2025) could not pool results because of heterogeneity in design, setting, and outcome measurement. When the scope is limited to private retail outlets assessed with simulated clients, however, the results of individual studies were consistent. Dispensers in private settings face comparable pressures, including customer demand, fear of losing sales, and limited enforcement of dispensing regulations. Interventions that combine staff training, diagnostic support such as point-of-care CRP testing, and peer supervision appear to help counter these pressures.</w:t>
       </w:r>
     </w:p>
     <w:p>
@@ -1095,7 +1095,7 @@
           <w:i w:val="0"/>
           <w:sz w:val="22"/>
         </w:rPr>
-        <w:t>Policy Implications: Legislation alone is unlikely to curb non-prescription antibiotic sales in LMICs, where enforcement capacity is often limited. Our results support the inclusion of pharmacy-focused packages, comprising dispenser education, rapid diagnostics, customer awareness campaigns, and peer supervision, in national action plans for antimicrobial resistance. Within the Sustainable Health 5.0 framework, community pharmacy stewardship represents a sustainable, decentralised intervention platform that aligns with the health-related Sustainable Development Goals (SDG 3 and its target 3.d on strengthening capacity for early warning and risk reduction).</w:t>
+        <w:t>Policy Implications: Legislation alone may not be sufficient to curb non-prescription antibiotic sales in LMICs, where enforcement capacity is often limited. Our findings are consistent with the inclusion of pharmacy-focused packages, comprising dispenser education, rapid diagnostics, customer awareness campaigns, and peer supervision, in national action plans for antimicrobial resistance. Within the Sustainable Health 5.0 framework, community pharmacy stewardship represents a sustainable, decentralised intervention platform that aligns with the health-related Sustainable Development Goals (SDG 3 and its target 3.d on strengthening capacity for early warning and risk reduction).</w:t>
       </w:r>
     </w:p>
     <w:p>
@@ -1139,7 +1139,7 @@
           <w:i w:val="0"/>
           <w:sz w:val="22"/>
         </w:rPr>
-        <w:t>Multifaceted interventions that combine dispenser education, rapid diagnostic testing, customer awareness, and peer supervision were associated with significantly lower odds of non-prescription antibiotic dispensing in LMIC community pharmacies (pooled OR = 0.164, 95% CI: 0.102-0.265). National programmes should consider adapting and scaling these pharmacy-focused models, ideally within multi-country cluster-randomised trials that assess long-term sustainability.</w:t>
+        <w:t>Multifaceted interventions that combine dispenser education, rapid diagnostic testing, customer awareness, and peer supervision were associated with significantly lower odds of non-prescription antibiotic dispensing in private community pharmacies in LMICs (pooled OR = 0.164, 95% CI: 0.102-0.265). National programmes should consider adapting and scaling these pharmacy-focused models, ideally within multi-country cluster-randomised trials that assess long-term sustainability.</w:t>
       </w:r>
     </w:p>
     <w:p>
@@ -1183,7 +1183,7 @@
           <w:i w:val="0"/>
           <w:sz w:val="22"/>
         </w:rPr>
-        <w:t>[ X ] Ethical Approval: Ethical approval was not required as this study is a secondary systematic review and meta-analysis of publicly available, published trial data.</w:t>
+        <w:t>[ X ] Ethical Approval: Ethical approval was not required as this study is a secondary systematic review and meta-analysis of publicly available, published study data. No primary human participants were recruited.</w:t>
       </w:r>
     </w:p>
     <w:p>
@@ -1284,7 +1284,7 @@
           <w:rFonts w:ascii="Times New Roman" w:hAnsi="Times New Roman"/>
           <w:sz w:val="19"/>
         </w:rPr>
-        <w:t>4.  Chalker J, Ratanawijitrasin S, Chuc NTK, Petzold M, Tomson G. Effectiveness of a multi-component intervention on dispensing practices at private pharmacies in Vietnam and Thailand: a randomized controlled trial. Soc Sci Med. 2005;60(1):131-41.</w:t>
+        <w:t>4.  Thandar MM, Baba T, Matsuoka S, Ota E. Interventions to reduce non-prescription antimicrobial sales in community pharmacies. Cochrane Database Syst Rev. 2025;(1):CD013722. doi: 10.1002/14651858.CD013722.pub2.</w:t>
       </w:r>
     </w:p>
     <w:p>
@@ -1297,7 +1297,7 @@
           <w:rFonts w:ascii="Times New Roman" w:hAnsi="Times New Roman"/>
           <w:sz w:val="19"/>
         </w:rPr>
-        <w:t>5.  Onwunduba A, Ekwunife O, Onyilogwu E, Onyemelukwe C, Modebe A, Igbokwe D. Impact of point-of-care C-reactive protein testing intervention on non-prescription dispensing of antibiotics for respiratory tract infections in private community pharmacies in Nigeria: a cluster randomized controlled trial. Int J Infect Dis. 2023;127:137-43.</w:t>
+        <w:t>5.  Page MJ, McKenzie JE, Bossuyt PM, Boutron I, Hoffmann TC, Mulrow CD, et al. The PRISMA 2020 statement: an updated guideline for reporting systematic reviews. BMJ. 2021;372:n71. doi: 10.1136/bmj.n71.</w:t>
       </w:r>
     </w:p>
     <w:p>
@@ -1310,7 +1310,7 @@
           <w:rFonts w:ascii="Times New Roman" w:hAnsi="Times New Roman"/>
           <w:sz w:val="19"/>
         </w:rPr>
-        <w:t>6.  Ferdiana A, Wulandari LPL, Liverani M, Limato R, Essiet I, Mcknight J, et al. The impact of a multi-faceted intervention on non-prescription dispensing of antibiotics by urban community pharmacies in Indonesia: a mixed methods evaluation. BMJ Glob Health. 2024;9(10):e015620.</w:t>
+        <w:t>6.  Chalker J, Chuc NTK, Falkenberg T, Tomson G. Private pharmacies in Hanoi, Vietnam: a randomized trial of a 2-year multi-component intervention on knowledge and stated practice regarding ARI, STD and antibiotic/steroid requests. Trop Med Int Health. 2002;7(9):803-10. doi: 10.1046/j.1365-3156.2002.00934.x.</w:t>
       </w:r>
     </w:p>
     <w:p>
@@ -1323,7 +1323,7 @@
           <w:rFonts w:ascii="Times New Roman" w:hAnsi="Times New Roman"/>
           <w:sz w:val="19"/>
         </w:rPr>
-        <w:t>7.  Tumwikirize WA, Ekwaru PJ, Mohammed K, Ogwal-Okeng JW, Aupont O. Impact of a face-to-face educational intervention on improving the management of acute respiratory infections in private pharmacies and drug shops in Uganda. East Afr Med J. 2004;81(Suppl 1):S33-40.</w:t>
+        <w:t>7.  Chuc NTK, Larsson M, Do NT, Diwan VK, Tomson GB, Falkenberg T. Improving private pharmacy practice: a multi-intervention experiment in Hanoi, Vietnam. J Clin Epidemiol. 2002;55(11):1148-55. doi: 10.1016/s0895-4356(02)00458-4.</w:t>
       </w:r>
     </w:p>
     <w:p>
@@ -1336,7 +1336,7 @@
           <w:rFonts w:ascii="Times New Roman" w:hAnsi="Times New Roman"/>
           <w:sz w:val="19"/>
         </w:rPr>
-        <w:t>8.  DerSimonian R, Laird N. Meta-analysis in clinical trials. Control Clin Trials. 1986;7(3):177-88.</w:t>
+        <w:t>8.  Chalker J, Ratanawijitrasin S, Chuc NTK, Petzold M, Tomson G. Effectiveness of a multi-component intervention on dispensing practices at private pharmacies in Vietnam and Thailand: a randomized controlled trial. Soc Sci Med. 2005;60(1):131-41. doi: 10.1016/j.socscimed.2004.04.019.</w:t>
       </w:r>
     </w:p>
     <w:p>
@@ -1349,7 +1349,215 @@
           <w:rFonts w:ascii="Times New Roman" w:hAnsi="Times New Roman"/>
           <w:sz w:val="19"/>
         </w:rPr>
-        <w:t>9.  Higgins JPT, Thompson SG, Deeks JJ, Altman DG. Measuring inconsistency in meta-analyses. BMJ. 2003;327(7414):557-60.</w:t>
+        <w:t>9.  Onwunduba A, Ekwunife O, Onyilogwu E, Onyemelukwe C, Modebe A, Igbokwe D. Impact of point-of-care C-reactive protein testing intervention on non-prescription dispensing of antibiotics for respiratory tract infections in private community pharmacies in Nigeria: a cluster randomized controlled trial. Int J Infect Dis. 2023;127:137-43. doi: 10.1016/j.ijid.2022.12.012.</w:t>
+      </w:r>
+    </w:p>
+    <w:p>
+      <w:pPr>
+        <w:spacing w:after="80" w:line="276" w:lineRule="auto"/>
+        <w:ind w:left="432" w:hanging="432"/>
+      </w:pPr>
+      <w:r>
+        <w:rPr>
+          <w:rFonts w:ascii="Times New Roman" w:hAnsi="Times New Roman"/>
+          <w:sz w:val="19"/>
+        </w:rPr>
+        <w:t>10.  Ferdiana A, Wulandari LPL, Liverani M, Limato R, Essiet I, Mcknight J, et al. The impact of a multi-faceted intervention on non-prescription dispensing of antibiotics by urban community pharmacies in Indonesia: a mixed methods evaluation. BMJ Glob Health. 2024;9(10):e015620. doi: 10.1136/bmjgh-2024-015620.</w:t>
+      </w:r>
+    </w:p>
+    <w:p>
+      <w:pPr>
+        <w:spacing w:after="80" w:line="276" w:lineRule="auto"/>
+        <w:ind w:left="432" w:hanging="432"/>
+      </w:pPr>
+      <w:r>
+        <w:rPr>
+          <w:rFonts w:ascii="Times New Roman" w:hAnsi="Times New Roman"/>
+          <w:sz w:val="19"/>
+        </w:rPr>
+        <w:t>11.  Tumwikirize WA, Ekwaru PJ, Mohammed K, Ogwal-Okeng JW, Aupont O. Impact of a face-to-face educational intervention on improving the management of acute respiratory infections in private pharmacies and drug shops in Uganda. East Afr Med J. 2004;81(Suppl 1):S33-40.</w:t>
+      </w:r>
+    </w:p>
+    <w:p>
+      <w:pPr>
+        <w:spacing w:after="80" w:line="276" w:lineRule="auto"/>
+        <w:ind w:left="432" w:hanging="432"/>
+      </w:pPr>
+      <w:r>
+        <w:rPr>
+          <w:rFonts w:ascii="Times New Roman" w:hAnsi="Times New Roman"/>
+          <w:sz w:val="19"/>
+        </w:rPr>
+        <w:t>12.  Rutta E, Liana J, Embrey M, Johnson K, Kimatta S, et al. Accrediting retail drug shops to strengthen Tanzania's public health system: an ADDO case study. J Pharm Policy Pract. 2015;8(1):23. doi: 10.1186/s40545-015-0044-4.</w:t>
+      </w:r>
+    </w:p>
+    <w:p>
+      <w:pPr>
+        <w:spacing w:after="80" w:line="276" w:lineRule="auto"/>
+        <w:ind w:left="432" w:hanging="432"/>
+      </w:pPr>
+      <w:r>
+        <w:rPr>
+          <w:rFonts w:ascii="Times New Roman" w:hAnsi="Times New Roman"/>
+          <w:sz w:val="19"/>
+        </w:rPr>
+        <w:t>13.  Simba D, Kakoko D, Semali I, Kessy A, Embrey M. Household knowledge of antimicrobials and antimicrobial resistance in the wake of an accredited drug dispensing outlet (ADDO) program rollout in Tanzania. PLoS One. 2016;11(9):e0163246. doi: 10.1371/journal.pone.0163246.</w:t>
+      </w:r>
+    </w:p>
+    <w:p>
+      <w:pPr>
+        <w:spacing w:after="80" w:line="276" w:lineRule="auto"/>
+        <w:ind w:left="432" w:hanging="432"/>
+      </w:pPr>
+      <w:r>
+        <w:rPr>
+          <w:rFonts w:ascii="Times New Roman" w:hAnsi="Times New Roman"/>
+          <w:sz w:val="19"/>
+        </w:rPr>
+        <w:t>14.  Chowdhury F, Sturm-Ramirez K, Mamun AA, Iuliano AD, Chisti MJ, et al. Effectiveness of an educational intervention to improve antibiotic dispensing practices for acute respiratory illness among drug sellers in pharmacies, a pilot study in Bangladesh. BMC Health Serv Res. 2018;18(1):680. doi: 10.1186/s12913-018-3486-y.</w:t>
+      </w:r>
+    </w:p>
+    <w:p>
+      <w:pPr>
+        <w:spacing w:after="80" w:line="276" w:lineRule="auto"/>
+        <w:ind w:left="432" w:hanging="432"/>
+      </w:pPr>
+      <w:r>
+        <w:rPr>
+          <w:rFonts w:ascii="Times New Roman" w:hAnsi="Times New Roman"/>
+          <w:sz w:val="19"/>
+        </w:rPr>
+        <w:t>15.  Wei X, Zhang Z, Hicks JP, Walley J, King R, et al. Long-term outcomes of an educational intervention to reduce antibiotic prescribing for childhood upper respiratory tract infections in rural China: follow-up of a cluster-randomised controlled trial. PLoS Med. 2019;16(2):e1002733. doi: 10.1371/journal.pmed.1002733.</w:t>
+      </w:r>
+    </w:p>
+    <w:p>
+      <w:pPr>
+        <w:spacing w:after="80" w:line="276" w:lineRule="auto"/>
+        <w:ind w:left="432" w:hanging="432"/>
+      </w:pPr>
+      <w:r>
+        <w:rPr>
+          <w:rFonts w:ascii="Times New Roman" w:hAnsi="Times New Roman"/>
+          <w:sz w:val="19"/>
+        </w:rPr>
+        <w:t>16.  Saleh D, Abu Farha R, Alefishat E. Impact of educational intervention to promote Jordanian community pharmacists' knowledge and perception towards antimicrobial stewardship: pre-post interventional study. Infect Drug Resist. 2021;14:2229-39. doi: 10.2147/IDR.S324865.</w:t>
+      </w:r>
+    </w:p>
+    <w:p>
+      <w:pPr>
+        <w:spacing w:after="80" w:line="276" w:lineRule="auto"/>
+        <w:ind w:left="432" w:hanging="432"/>
+      </w:pPr>
+      <w:r>
+        <w:rPr>
+          <w:rFonts w:ascii="Times New Roman" w:hAnsi="Times New Roman"/>
+          <w:sz w:val="19"/>
+        </w:rPr>
+        <w:t>17.  Bocquier A, Essilini A, Pereira O, Welter A, Pulcini C, et al. Impact of a public commitment charter, a non-prescription pad and an antibiotic information leaflet to improve antibiotic prescription among general practitioners: a randomised controlled study. J Infect Public Health. 2023;16(1):12-20. doi: 10.1016/j.jiph.2023.11.027.</w:t>
+      </w:r>
+    </w:p>
+    <w:p>
+      <w:pPr>
+        <w:spacing w:after="80" w:line="276" w:lineRule="auto"/>
+        <w:ind w:left="432" w:hanging="432"/>
+      </w:pPr>
+      <w:r>
+        <w:rPr>
+          <w:rFonts w:ascii="Times New Roman" w:hAnsi="Times New Roman"/>
+          <w:sz w:val="19"/>
+        </w:rPr>
+        <w:t>18.  Saif A, Khan TM, Bukhsh A, Yaseen MO, Saif A. Cross-sectional survey to explore knowledge, attitude, practices and impact of an intervention programme related to antibiotic misuse and self-medication among general population of Pakistan. BMJ Public Health. 2024;2:e000758. doi: 10.1136/bmjph-2023-000758.</w:t>
+      </w:r>
+    </w:p>
+    <w:p>
+      <w:pPr>
+        <w:spacing w:after="80" w:line="276" w:lineRule="auto"/>
+        <w:ind w:left="432" w:hanging="432"/>
+      </w:pPr>
+      <w:r>
+        <w:rPr>
+          <w:rFonts w:ascii="Times New Roman" w:hAnsi="Times New Roman"/>
+          <w:sz w:val="19"/>
+        </w:rPr>
+        <w:t>19.  Visser T, Laktabai J, Kimachas E, Kipkoech J, Menya D, et al. A cluster-randomized trial of client and provider directed financial interventions to align incentives with appropriate case management in private medicine retailers: results of the TESTsmART trial in Lagos, Nigeria. PLOS Glob Public Health. 2024;4(5):e0002938. doi: 10.1371/journal.pgph.0002938.</w:t>
+      </w:r>
+    </w:p>
+    <w:p>
+      <w:pPr>
+        <w:spacing w:after="80" w:line="276" w:lineRule="auto"/>
+        <w:ind w:left="432" w:hanging="432"/>
+      </w:pPr>
+      <w:r>
+        <w:rPr>
+          <w:rFonts w:ascii="Times New Roman" w:hAnsi="Times New Roman"/>
+          <w:sz w:val="19"/>
+        </w:rPr>
+        <w:t>20.  Nguyen VN, Do NTT, Vu HTL, Bui PB, Pham TQ, et al. Understanding acceptability and willingness-to-pay for a C-reactive protein point-of-care testing service to improve antibiotic dispensing for respiratory infections in Vietnamese pharmacies: a mixed-methods study. Open Forum Infect Dis. 2024;11(9):ofae445. doi: 10.1093/ofid/ofae445.</w:t>
+      </w:r>
+    </w:p>
+    <w:p>
+      <w:pPr>
+        <w:spacing w:after="80" w:line="276" w:lineRule="auto"/>
+        <w:ind w:left="432" w:hanging="432"/>
+      </w:pPr>
+      <w:r>
+        <w:rPr>
+          <w:rFonts w:ascii="Times New Roman" w:hAnsi="Times New Roman"/>
+          <w:sz w:val="19"/>
+        </w:rPr>
+        <w:t>21.  Saha SK, Muleme M, Van Hecke O, Chatterton ML, Athan E. Feasibility of C-reactive protein point-of-care testing for antibiotic stewardship in rural GP-pharmacy settings. Antimicrob Steward Healthc Epidemiol. 2026;6(1):e10401. doi: 10.1017/ash.2026.10401.</w:t>
+      </w:r>
+    </w:p>
+    <w:p>
+      <w:pPr>
+        <w:spacing w:after="80" w:line="276" w:lineRule="auto"/>
+        <w:ind w:left="432" w:hanging="432"/>
+      </w:pPr>
+      <w:r>
+        <w:rPr>
+          <w:rFonts w:ascii="Times New Roman" w:hAnsi="Times New Roman"/>
+          <w:sz w:val="19"/>
+        </w:rPr>
+        <w:t>22.  DerSimonian R, Laird N. Meta-analysis in clinical trials. Control Clin Trials. 1986;7(3):177-88.</w:t>
+      </w:r>
+    </w:p>
+    <w:p>
+      <w:pPr>
+        <w:spacing w:after="80" w:line="276" w:lineRule="auto"/>
+        <w:ind w:left="432" w:hanging="432"/>
+      </w:pPr>
+      <w:r>
+        <w:rPr>
+          <w:rFonts w:ascii="Times New Roman" w:hAnsi="Times New Roman"/>
+          <w:sz w:val="19"/>
+        </w:rPr>
+        <w:t>23.  Higgins JPT, Thompson SG, Deeks JJ, Altman DG. Measuring inconsistency in meta-analyses. BMJ. 2003;327(7414):557-60.</w:t>
+      </w:r>
+    </w:p>
+    <w:p>
+      <w:pPr>
+        <w:spacing w:after="80" w:line="276" w:lineRule="auto"/>
+        <w:ind w:left="432" w:hanging="432"/>
+      </w:pPr>
+      <w:r>
+        <w:rPr>
+          <w:rFonts w:ascii="Times New Roman" w:hAnsi="Times New Roman"/>
+          <w:sz w:val="19"/>
+        </w:rPr>
+        <w:t>24.  Hartung J, Knapp G. A refined method for the meta-analysis of controlled clinical trials with binary outcome. Stat Med. 2001;20(24):3875-89.</w:t>
+      </w:r>
+    </w:p>
+    <w:p>
+      <w:pPr>
+        <w:spacing w:after="80" w:line="276" w:lineRule="auto"/>
+        <w:ind w:left="432" w:hanging="432"/>
+      </w:pPr>
+      <w:r>
+        <w:rPr>
+          <w:rFonts w:ascii="Times New Roman" w:hAnsi="Times New Roman"/>
+          <w:sz w:val="19"/>
+        </w:rPr>
+        <w:t>25.  Sidi K, Jonkman JN. A comparison of heterogeneity variance estimators in combining results of studies. Stat Med. 2002;21(11):1521-32.</w:t>
       </w:r>
     </w:p>
     <w:sectPr>

</xml_diff>